<commit_message>
Les autoritzacions, abans del 27 d octubre; a produccio no hi ha res a provar
Aclariment demanat, i era necessari: la validacio del projecte es fa tota a
test i esta feta. El que es va a buscar a l altra banda no es una prova, son
dues coses d una altra naturalesa: una precondicio de dades que no es nostra
-que U_FCCodiKais hi sigui i estigui poblat- i un permis, que per definicio no
es pot comprovar a test.

Aixi que el correu ja no demana lectura ara: la demana a punt abans del 27
d octubre, que es quan el runbook preveu la mesura de la cobertura i del
volum. El punt 1 si que es d ara, perque no es una prova ni una mesura: es una
dada que ha d entrar per la migracio de mestres a produccio, que passa abans
del tall.

Co-Authored-By: Claude Opus 5 (1M context) <noreply@anthropic.com>
</commit_message>
<xml_diff>
--- a/peticio_seidor_produccio.docx
+++ b/peticio_seidor_produccio.docx
@@ -297,14 +297,14 @@
           <w:b/>
           <w:i w:val="0"/>
         </w:rPr>
-        <w:t>.</w:t>
+        <w:t>, a punt abans del 27 d'octubre.</w:t>
       </w:r>
       <w:r>
         <w:rPr>
           <w:b w:val="0"/>
           <w:i w:val="0"/>
         </w:rPr>
-        <w:t xml:space="preserve"> Avui he provat la connexió contra la productiva i el </w:t>
+        <w:t xml:space="preserve"> No les necessito avui —la validació del procés es fa tota contra la companyia de test, i allà ja funciona—, però el dia del tall l'únic canvi que faig és apuntar el procés a la companyia productiva, i això ha d'estar resolt abans. Ho he comprovat avui: el </w:t>
       </w:r>
       <w:r>
         <w:rPr>
@@ -321,7 +321,7 @@
           <w:b w:val="0"/>
           <w:i w:val="0"/>
         </w:rPr>
-        <w:t xml:space="preserve"> entra correctament, però la primera lectura respon:</w:t>
+        <w:t xml:space="preserve"> entra correctament, i la primera lectura respon:</w:t>
       </w:r>
     </w:p>
     <w:p>
@@ -421,21 +421,21 @@
           <w:b w:val="0"/>
           <w:i w:val="0"/>
         </w:rPr>
-        <w:t xml:space="preserve">Això no és només per al dia del tall: </w:t>
+        <w:t xml:space="preserve">La setmana del </w:t>
       </w:r>
       <w:r>
         <w:rPr>
           <w:b/>
           <w:i w:val="0"/>
         </w:rPr>
-        <w:t>sense lectura no puc mesurar res</w:t>
+        <w:t>27 al 31 d'octubre</w:t>
       </w:r>
       <w:r>
         <w:rPr>
           <w:b w:val="0"/>
           <w:i w:val="0"/>
         </w:rPr>
-        <w:t xml:space="preserve"> de la productiva, i hi ha comprovacions que, si surten malament, són setmanes de feina (la cobertura dels codis de KAIS, el volum de documents que ha de baixar la primera càrrega).</w:t>
+        <w:t xml:space="preserve"> tinc previst fer una passada de lectura contra la productiva per mesurar dues coses que a test no es poden veure: la cobertura real dels codis de KAIS i el volum de documents que ha de baixar la primera càrrega. Si aquella setmana encara no hi ha lectura, el dia 2 anem a cegues.</w:t>
       </w:r>
     </w:p>
     <w:p>

</xml_diff>